<commit_message>
Tài liệu kì 2 năm 3
</commit_message>
<xml_diff>
--- a/Mật mã học cơ sở/Labtainer-bls-bft.docx
+++ b/Mật mã học cơ sở/Labtainer-bls-bft.docx
@@ -767,7 +767,17 @@
           <w:szCs w:val="26"/>
           <w:lang w:val="vi-VN"/>
         </w:rPr>
-        <w:t>3-</w:t>
+        <w:t>5</w:t>
+      </w:r>
+      <w:r>
+        <w:rPr>
+          <w:b/>
+          <w:bCs/>
+          <w:sz w:val="28"/>
+          <w:szCs w:val="26"/>
+          <w:lang w:val="vi-VN"/>
+        </w:rPr>
+        <w:t>-</w:t>
       </w:r>
       <w:r>
         <w:rPr>
@@ -2076,7 +2086,19 @@
         <w:rPr>
           <w:lang w:val="vi-VN"/>
         </w:rPr>
-        <w:t>kiến thức về chữ ký số BLS, xác thực danh tính trong hệ thống phân tán, reply attack và cách phòng chống, Quorum Certificate(QC) và cơ chế đồng thuận BFT để đề xuất các phòng chống.</w:t>
+        <w:t xml:space="preserve">kiến thức về chữ ký số BLS, xác thực danh tính trong hệ thống phân tán, reply attack và cách phòng chống, Quorum Certificate(QC) và cơ chế đồng thuận BFT để đề xuất các </w:t>
+      </w:r>
+      <w:r>
+        <w:rPr>
+          <w:lang w:val="vi-VN"/>
+        </w:rPr>
+        <w:t xml:space="preserve">cách </w:t>
+      </w:r>
+      <w:r>
+        <w:rPr>
+          <w:lang w:val="vi-VN"/>
+        </w:rPr>
+        <w:t>phòng chống.</w:t>
       </w:r>
     </w:p>
     <w:p>
@@ -2257,239 +2279,6 @@
       </w:r>
       <w:bookmarkStart w:id="0" w:name="_GoBack"/>
       <w:bookmarkEnd w:id="0"/>
-    </w:p>
-    <w:p>
-      <w:pPr>
-        <w:pStyle w:val="BTL-Text"/>
-        <w:rPr>
-          <w:lang w:val="vi-VN"/>
-        </w:rPr>
-      </w:pPr>
-    </w:p>
-    <w:p>
-      <w:pPr>
-        <w:spacing w:after="160" w:line="259" w:lineRule="auto"/>
-        <w:jc w:val="left"/>
-        <w:rPr>
-          <w:sz w:val="26"/>
-          <w:lang w:val="vi-VN"/>
-        </w:rPr>
-      </w:pPr>
-      <w:r>
-        <w:rPr>
-          <w:lang w:val="vi-VN"/>
-        </w:rPr>
-        <w:br w:type="page"/>
-      </w:r>
-    </w:p>
-    <w:p>
-      <w:pPr>
-        <w:pStyle w:val="BTL-Text"/>
-        <w:rPr>
-          <w:sz w:val="24"/>
-          <w:szCs w:val="20"/>
-          <w:lang w:val="vi-VN"/>
-        </w:rPr>
-      </w:pPr>
-    </w:p>
-    <w:p>
-      <w:pPr>
-        <w:pStyle w:val="BTL-Text"/>
-        <w:rPr>
-          <w:szCs w:val="20"/>
-          <w:lang w:val="vi-VN"/>
-        </w:rPr>
-      </w:pPr>
-      <w:r>
-        <w:rPr>
-          <w:szCs w:val="20"/>
-          <w:lang w:val="vi-VN"/>
-        </w:rPr>
-        <w:br w:type="page"/>
-      </w:r>
-    </w:p>
-    <w:p>
-      <w:pPr>
-        <w:pStyle w:val="BTL-Text"/>
-        <w:rPr>
-          <w:b/>
-          <w:caps/>
-          <w:lang w:val="vi-VN"/>
-        </w:rPr>
-      </w:pPr>
-      <w:r>
-        <w:rPr>
-          <w:lang w:val="vi-VN"/>
-        </w:rPr>
-        <w:lastRenderedPageBreak/>
-        <w:br w:type="page"/>
-      </w:r>
-    </w:p>
-    <w:p>
-      <w:pPr>
-        <w:pStyle w:val="BTL-Text"/>
-        <w:spacing w:line="288" w:lineRule="auto"/>
-        <w:rPr>
-          <w:lang w:val="vi-VN"/>
-        </w:rPr>
-      </w:pPr>
-    </w:p>
-    <w:p>
-      <w:pPr>
-        <w:pStyle w:val="BTL-Text"/>
-        <w:spacing w:line="288" w:lineRule="auto"/>
-        <w:rPr>
-          <w:lang w:val="vi-VN"/>
-        </w:rPr>
-      </w:pPr>
-    </w:p>
-    <w:p>
-      <w:pPr>
-        <w:pStyle w:val="BTL-Text"/>
-        <w:spacing w:line="288" w:lineRule="auto"/>
-        <w:rPr>
-          <w:lang w:val="vi-VN"/>
-        </w:rPr>
-      </w:pPr>
-    </w:p>
-    <w:p>
-      <w:pPr>
-        <w:pStyle w:val="BTL-Text"/>
-        <w:spacing w:line="288" w:lineRule="auto"/>
-        <w:rPr>
-          <w:lang w:val="vi-VN"/>
-        </w:rPr>
-      </w:pPr>
-    </w:p>
-    <w:p>
-      <w:pPr>
-        <w:pStyle w:val="BTL-Text"/>
-        <w:spacing w:line="288" w:lineRule="auto"/>
-        <w:rPr>
-          <w:lang w:val="vi-VN"/>
-        </w:rPr>
-      </w:pPr>
-    </w:p>
-    <w:p>
-      <w:pPr>
-        <w:pStyle w:val="BTL-Text"/>
-        <w:spacing w:line="288" w:lineRule="auto"/>
-        <w:rPr>
-          <w:lang w:val="vi-VN"/>
-        </w:rPr>
-      </w:pPr>
-    </w:p>
-    <w:p>
-      <w:pPr>
-        <w:pStyle w:val="BTL-Text"/>
-        <w:spacing w:line="288" w:lineRule="auto"/>
-        <w:rPr>
-          <w:lang w:val="vi-VN"/>
-        </w:rPr>
-      </w:pPr>
-    </w:p>
-    <w:p>
-      <w:pPr>
-        <w:pStyle w:val="BTL-Text"/>
-        <w:spacing w:line="288" w:lineRule="auto"/>
-        <w:rPr>
-          <w:lang w:val="vi-VN"/>
-        </w:rPr>
-      </w:pPr>
-    </w:p>
-    <w:p>
-      <w:pPr>
-        <w:pStyle w:val="BTL-Text"/>
-        <w:spacing w:line="288" w:lineRule="auto"/>
-        <w:rPr>
-          <w:lang w:val="vi-VN"/>
-        </w:rPr>
-      </w:pPr>
-    </w:p>
-    <w:p>
-      <w:pPr>
-        <w:pStyle w:val="BTL-Text"/>
-        <w:spacing w:line="288" w:lineRule="auto"/>
-        <w:rPr>
-          <w:lang w:val="vi-VN"/>
-        </w:rPr>
-      </w:pPr>
-    </w:p>
-    <w:p>
-      <w:pPr>
-        <w:pStyle w:val="BTL-Text"/>
-        <w:rPr>
-          <w:lang w:val="vi-VN"/>
-        </w:rPr>
-      </w:pPr>
-      <w:r>
-        <w:rPr>
-          <w:lang w:val="vi-VN"/>
-        </w:rPr>
-        <w:br w:type="page"/>
-      </w:r>
-    </w:p>
-    <w:p>
-      <w:pPr>
-        <w:spacing w:after="160" w:line="259" w:lineRule="auto"/>
-        <w:jc w:val="left"/>
-        <w:rPr>
-          <w:sz w:val="26"/>
-          <w:lang w:val="vi-VN"/>
-        </w:rPr>
-      </w:pPr>
-      <w:r>
-        <w:rPr>
-          <w:lang w:val="vi-VN"/>
-        </w:rPr>
-        <w:lastRenderedPageBreak/>
-        <w:br w:type="page"/>
-      </w:r>
-    </w:p>
-    <w:p>
-      <w:pPr>
-        <w:spacing w:after="160" w:line="259" w:lineRule="auto"/>
-        <w:jc w:val="left"/>
-        <w:rPr>
-          <w:sz w:val="26"/>
-          <w:lang w:val="vi-VN"/>
-        </w:rPr>
-      </w:pPr>
-      <w:r>
-        <w:rPr>
-          <w:lang w:val="vi-VN"/>
-        </w:rPr>
-        <w:lastRenderedPageBreak/>
-        <w:br w:type="page"/>
-      </w:r>
-    </w:p>
-    <w:p>
-      <w:pPr>
-        <w:pStyle w:val="BTL-Text"/>
-        <w:rPr>
-          <w:lang w:val="vi-VN"/>
-        </w:rPr>
-      </w:pPr>
-      <w:r>
-        <w:rPr>
-          <w:lang w:val="vi-VN"/>
-        </w:rPr>
-        <w:lastRenderedPageBreak/>
-        <w:br w:type="page"/>
-      </w:r>
-    </w:p>
-    <w:p>
-      <w:pPr>
-        <w:pStyle w:val="BTL-Bullet1"/>
-        <w:numPr>
-          <w:ilvl w:val="0"/>
-          <w:numId w:val="0"/>
-        </w:numPr>
-        <w:ind w:left="360"/>
-        <w:rPr>
-          <w:lang w:val="vi-VN"/>
-        </w:rPr>
-      </w:pPr>
     </w:p>
     <w:sectPr>
       <w:footerReference w:type="default" r:id="rId10"/>
@@ -2581,7 +2370,7 @@
         <w:noProof/>
         <w:sz w:val="22"/>
       </w:rPr>
-      <w:t>12</w:t>
+      <w:t>5</w:t>
     </w:r>
     <w:r>
       <w:rPr>
@@ -6072,7 +5861,7 @@
 </file>
 
 <file path=customXml/itemProps1.xml><?xml version="1.0" encoding="utf-8"?>
-<ds:datastoreItem xmlns:ds="http://schemas.openxmlformats.org/officeDocument/2006/customXml" ds:itemID="{C757A223-600E-4C30-B90F-DA6BBE568AB9}">
+<ds:datastoreItem xmlns:ds="http://schemas.openxmlformats.org/officeDocument/2006/customXml" ds:itemID="{1A0C7577-5BEC-4F06-98F5-34A9A442F7D4}">
   <ds:schemaRefs>
     <ds:schemaRef ds:uri="http://schemas.openxmlformats.org/officeDocument/2006/bibliography"/>
   </ds:schemaRefs>

</xml_diff>